<commit_message>
feat(pertussis): latest application changes
Calibration, provenance, UI improvements, 7 age bands, ABC-SMC,
hospitalization model, vaccination planner, and documentation updates.

Co-Authored-By: Claude Opus 4.6 <noreply@anthropic.com>
</commit_message>
<xml_diff>
--- a/Pertussis Modeling - V0.5.docx
+++ b/Pertussis Modeling - V0.5.docx
@@ -1,6 +1,6 @@
 
 <file path=word/document.xml><?xml version="1.0" encoding="utf-8"?>
-<w:document xmlns:wpc="http://schemas.microsoft.com/office/word/2010/wordprocessingCanvas" xmlns:cx="http://schemas.microsoft.com/office/drawing/2014/chartex" xmlns:cx1="http://schemas.microsoft.com/office/drawing/2015/9/8/chartex" xmlns:cx2="http://schemas.microsoft.com/office/drawing/2015/10/21/chartex" xmlns:cx3="http://schemas.microsoft.com/office/drawing/2016/5/9/chartex" xmlns:cx4="http://schemas.microsoft.com/office/drawing/2016/5/10/chartex" xmlns:cx5="http://schemas.microsoft.com/office/drawing/2016/5/11/chartex" xmlns:cx6="http://schemas.microsoft.com/office/drawing/2016/5/12/chartex" xmlns:cx7="http://schemas.microsoft.com/office/drawing/2016/5/13/chartex" xmlns:cx8="http://schemas.microsoft.com/office/drawing/2016/5/14/chartex" xmlns:mc="http://schemas.openxmlformats.org/markup-compatibility/2006" xmlns:aink="http://schemas.microsoft.com/office/drawing/2016/ink" xmlns:am3d="http://schemas.microsoft.com/office/drawing/2017/model3d" xmlns:o="urn:schemas-microsoft-com:office:office" xmlns:oel="http://schemas.microsoft.com/office/2019/extlst" xmlns:r="http://schemas.openxmlformats.org/officeDocument/2006/relationships" xmlns:m="http://schemas.openxmlformats.org/officeDocument/2006/math" xmlns:v="urn:schemas-microsoft-com:vml" xmlns:wp14="http://schemas.microsoft.com/office/word/2010/wordprocessingDrawing" xmlns:wp="http://schemas.openxmlformats.org/drawingml/2006/wordprocessingDrawing" xmlns:w10="urn:schemas-microsoft-com:office:word" xmlns:w="http://schemas.openxmlformats.org/wordprocessingml/2006/main" xmlns:w14="http://schemas.microsoft.com/office/word/2010/wordml" xmlns:w15="http://schemas.microsoft.com/office/word/2012/wordml" xmlns:w16cex="http://schemas.microsoft.com/office/word/2018/wordml/cex" xmlns:w16cid="http://schemas.microsoft.com/office/word/2016/wordml/cid" xmlns:w16="http://schemas.microsoft.com/office/word/2018/wordml" xmlns:w16du="http://schemas.microsoft.com/office/word/2023/wordml/word16du" xmlns:w16sdtdh="http://schemas.microsoft.com/office/word/2020/wordml/sdtdatahash" xmlns:w16sdtfl="http://schemas.microsoft.com/office/word/2024/wordml/sdtformatlock" xmlns:w16se="http://schemas.microsoft.com/office/word/2015/wordml/symex" xmlns:wpg="http://schemas.microsoft.com/office/word/2010/wordprocessingGroup" xmlns:wpi="http://schemas.microsoft.com/office/word/2010/wordprocessingInk" xmlns:wne="http://schemas.microsoft.com/office/word/2006/wordml" xmlns:wps="http://schemas.microsoft.com/office/word/2010/wordprocessingShape" mc:Ignorable="w14 w15 w16se w16cid w16 w16cex w16sdtdh w16sdtfl w16du wp14">
+<w:document xmlns:wpc="http://schemas.microsoft.com/office/word/2010/wordprocessingCanvas" xmlns:cx="http://schemas.microsoft.com/office/drawing/2014/chartex" xmlns:cx1="http://schemas.microsoft.com/office/drawing/2015/9/8/chartex" xmlns:cx2="http://schemas.microsoft.com/office/drawing/2015/10/21/chartex" xmlns:cx3="http://schemas.microsoft.com/office/drawing/2016/5/9/chartex" xmlns:cx4="http://schemas.microsoft.com/office/drawing/2016/5/10/chartex" xmlns:cx5="http://schemas.microsoft.com/office/drawing/2016/5/11/chartex" xmlns:cx6="http://schemas.microsoft.com/office/drawing/2016/5/12/chartex" xmlns:cx7="http://schemas.microsoft.com/office/drawing/2016/5/13/chartex" xmlns:cx8="http://schemas.microsoft.com/office/drawing/2016/5/14/chartex" xmlns:mc="http://schemas.openxmlformats.org/markup-compatibility/2006" xmlns:aink="http://schemas.microsoft.com/office/drawing/2016/ink" xmlns:am3d="http://schemas.microsoft.com/office/drawing/2017/model3d" xmlns:o="urn:schemas-microsoft-com:office:office" xmlns:oel="http://schemas.microsoft.com/office/2019/extlst" xmlns:r="http://schemas.openxmlformats.org/officeDocument/2006/relationships" xmlns:m="http://schemas.openxmlformats.org/officeDocument/2006/math" xmlns:v="urn:schemas-microsoft-com:vml" xmlns:wp14="http://schemas.microsoft.com/office/word/2010/wordprocessingDrawing" xmlns:wp="http://schemas.openxmlformats.org/drawingml/2006/wordprocessingDrawing" xmlns:w10="urn:schemas-microsoft-com:office:word" xmlns:w="http://schemas.openxmlformats.org/wordprocessingml/2006/main" xmlns:w14="http://schemas.microsoft.com/office/word/2010/wordml" xmlns:w15="http://schemas.microsoft.com/office/word/2012/wordml" xmlns:w16cei="http://schemas.microsoft.com/office/word/2026/wordml/cei" xmlns:w16cex="http://schemas.microsoft.com/office/word/2018/wordml/cex" xmlns:w16cid="http://schemas.microsoft.com/office/word/2016/wordml/cid" xmlns:w16="http://schemas.microsoft.com/office/word/2018/wordml" xmlns:w16du="http://schemas.microsoft.com/office/word/2023/wordml/word16du" xmlns:w16sdtdh="http://schemas.microsoft.com/office/word/2020/wordml/sdtdatahash" xmlns:w16sdtfl="http://schemas.microsoft.com/office/word/2024/wordml/sdtformatlock" xmlns:w16se="http://schemas.microsoft.com/office/word/2015/wordml/symex" xmlns:wpg="http://schemas.microsoft.com/office/word/2010/wordprocessingGroup" xmlns:wpi="http://schemas.microsoft.com/office/word/2010/wordprocessingInk" xmlns:wne="http://schemas.microsoft.com/office/word/2006/wordml" xmlns:wps="http://schemas.microsoft.com/office/word/2010/wordprocessingShape" mc:Ignorable="w14 w15 w16se w16cid w16 w16cex w16sdtdh w16sdtfl w16du wp14">
   <w:body>
     <w:p>
       <w:pPr>
@@ -46,19 +46,13 @@
     </w:p>
     <w:p>
       <w:r>
-        <w:t>Mark Routson</w:t>
-      </w:r>
-      <w:r>
-        <w:t xml:space="preserve">, </w:t>
-      </w:r>
-      <w:r>
-        <w:t>Youssef Ziouani,</w:t>
-      </w:r>
-      <w:r>
-        <w:t xml:space="preserve"> </w:t>
-      </w:r>
-      <w:r>
-        <w:t xml:space="preserve"> Dr. Ryan Avery, Anibal Cruz, Emma Hapler</w:t>
+        <w:t xml:space="preserve">Dr. Ryan Avery, Anibal Cruz, </w:t>
+      </w:r>
+      <w:r>
+        <w:t xml:space="preserve">Mark Routson, </w:t>
+      </w:r>
+      <w:r>
+        <w:t>Emma Hapler</w:t>
       </w:r>
     </w:p>
     <w:p>
@@ -199,6 +193,14 @@
     </w:p>
     <w:sdt>
       <w:sdtPr>
+        <w:rPr>
+          <w:rFonts w:asciiTheme="minorHAnsi" w:eastAsiaTheme="minorHAnsi" w:hAnsiTheme="minorHAnsi" w:cstheme="minorBidi"/>
+          <w:color w:val="auto"/>
+          <w:kern w:val="2"/>
+          <w:sz w:val="24"/>
+          <w:szCs w:val="24"/>
+          <w14:ligatures w14:val="standardContextual"/>
+        </w:rPr>
         <w:id w:val="1608229158"/>
         <w:docPartObj>
           <w:docPartGallery w:val="Table of Contents"/>
@@ -207,15 +209,9 @@
       </w:sdtPr>
       <w:sdtEndPr>
         <w:rPr>
-          <w:rFonts w:asciiTheme="minorHAnsi" w:eastAsiaTheme="minorHAnsi" w:hAnsiTheme="minorHAnsi" w:cstheme="minorBidi"/>
           <w:b/>
           <w:bCs/>
           <w:noProof/>
-          <w:color w:val="auto"/>
-          <w:kern w:val="2"/>
-          <w:sz w:val="24"/>
-          <w:szCs w:val="24"/>
-          <w14:ligatures w14:val="standardContextual"/>
         </w:rPr>
       </w:sdtEndPr>
       <w:sdtContent>
@@ -954,34 +950,10 @@
     </w:p>
     <w:p>
       <w:r>
-        <w:t>Oregon’s Lane County has had a re-</w:t>
-      </w:r>
-      <w:proofErr w:type="spellStart"/>
-      <w:r>
-        <w:t>occuring</w:t>
-      </w:r>
-      <w:proofErr w:type="spellEnd"/>
-      <w:r>
-        <w:t xml:space="preserve"> surges in Pertussis over the last few years, and wants to see if there is a way to simulate/aid in predicting cases.</w:t>
-      </w:r>
-      <w:r>
-        <w:t xml:space="preserve"> We applied Anthropic to generate initial ideas and code for this specification. This will be evolved with engagement of </w:t>
-      </w:r>
-      <w:proofErr w:type="spellStart"/>
-      <w:r>
-        <w:t>Epydemix</w:t>
-      </w:r>
-      <w:proofErr w:type="spellEnd"/>
-      <w:r>
-        <w:t xml:space="preserve"> architect (Nicolo Gozzi), IRS Development Team (Youssef </w:t>
-      </w:r>
-      <w:proofErr w:type="spellStart"/>
-      <w:r>
-        <w:t>Ziouani</w:t>
-      </w:r>
-      <w:proofErr w:type="spellEnd"/>
-      <w:r>
-        <w:t>, Mark Routson, Chris Zhu) and IRS CFA team, Dr. Ryan Avery, Anibal Cruz, Emma Hapler.</w:t>
+        <w:t>Oregon’s Lane County has had a re-occuring surges in Pertussis over the last few years, and wants to see if there is a way to simulate/aid in predicting cases.</w:t>
+      </w:r>
+      <w:r>
+        <w:t xml:space="preserve"> We applied Anthropic to generate initial ideas and code for this specification. This will be evolved with engagement of Epydemix architect (Nicolo Gozzi), IRS Development Team (Youssef Ziouani, Mark Routson, Chris Zhu) and IRS CFA team, Dr. Ryan Avery, Anibal Cruz, Emma Hapler.</w:t>
       </w:r>
     </w:p>
     <w:p>
@@ -1028,15 +1000,7 @@
         <w:t>We are envisioning modeling it as an SEIR model with rounds of vaccination related to</w:t>
       </w:r>
       <w:r>
-        <w:t xml:space="preserve"> CDC recommendation of </w:t>
-      </w:r>
-      <w:proofErr w:type="spellStart"/>
-      <w:r>
-        <w:t>dTAP</w:t>
-      </w:r>
-      <w:proofErr w:type="spellEnd"/>
-      <w:r>
-        <w:t xml:space="preserve"> 5 round series, as depicted below:</w:t>
+        <w:t xml:space="preserve"> CDC recommendation of dTAP 5 round series, as depicted below:</w:t>
       </w:r>
       <w:r>
         <w:t xml:space="preserve"> </w:t>
@@ -1047,6 +1011,9 @@
         <w:jc w:val="center"/>
       </w:pPr>
       <w:r>
+        <w:rPr>
+          <w:noProof/>
+        </w:rPr>
         <w:lastRenderedPageBreak/>
         <w:drawing>
           <wp:inline distT="0" distB="0" distL="0" distR="0" wp14:anchorId="09DF11C5" wp14:editId="0B37CF2E">
@@ -1214,11 +1181,9 @@
       </w:r>
     </w:p>
     <w:p>
-      <w:proofErr w:type="spellStart"/>
       <w:r>
         <w:t>read_me</w:t>
       </w:r>
-      <w:proofErr w:type="spellEnd"/>
     </w:p>
     <w:p>
       <w:r>
@@ -1656,13 +1621,8 @@
         <w:t>Force of infection:</w:t>
       </w:r>
       <w:r>
-        <w:t xml:space="preserve"> both I and </w:t>
-      </w:r>
-      <w:proofErr w:type="spellStart"/>
-      <w:r>
-        <w:t>σI</w:t>
-      </w:r>
-      <w:proofErr w:type="spellEnd"/>
+        <w:t xml:space="preserve"> both I and σI</w:t>
+      </w:r>
       <w:r>
         <w:rPr>
           <w:rFonts w:ascii="Cambria Math" w:hAnsi="Cambria Math" w:cs="Cambria Math"/>
@@ -1734,6 +1694,9 @@
     </w:p>
     <w:p>
       <w:r>
+        <w:rPr>
+          <w:noProof/>
+        </w:rPr>
         <w:drawing>
           <wp:inline distT="0" distB="0" distL="0" distR="0" wp14:anchorId="2FFA1647" wp14:editId="26419816">
             <wp:extent cx="5943600" cy="3982720"/>
@@ -2055,15 +2018,7 @@
         <w:t>Section 4 — Transitions.</w:t>
       </w:r>
       <w:r>
-        <w:t xml:space="preserve"> This is the most important part. </w:t>
-      </w:r>
-      <w:proofErr w:type="spellStart"/>
-      <w:r>
-        <w:t>Epydemix</w:t>
-      </w:r>
-      <w:proofErr w:type="spellEnd"/>
-      <w:r>
-        <w:t xml:space="preserve"> uses two transition kinds: mediated for rates that depend on another compartment (the force of infection), and spontaneous for rates that depend only on the source compartment (recovery, waning, vaccination). </w:t>
+        <w:t xml:space="preserve"> This is the most important part. Epydemix uses two transition kinds: mediated for rates that depend on another compartment (the force of infection), and spontaneous for rates that depend only on the source compartment (recovery, waning, vaccination). </w:t>
       </w:r>
       <w:hyperlink r:id="rId11" w:tgtFrame="_blank" w:history="1">
         <w:r>
@@ -2074,21 +2029,8 @@
         </w:r>
       </w:hyperlink>
       <w:r>
-        <w:t xml:space="preserve"> Because </w:t>
-      </w:r>
-      <w:proofErr w:type="spellStart"/>
-      <w:r>
-        <w:t>epydemix's</w:t>
-      </w:r>
-      <w:proofErr w:type="spellEnd"/>
-      <w:r>
-        <w:t xml:space="preserve"> mediated type only accepts a single mediating compartment, the combined force of infection β(I + </w:t>
-      </w:r>
-      <w:proofErr w:type="spellStart"/>
-      <w:r>
-        <w:t>σI</w:t>
-      </w:r>
-      <w:proofErr w:type="spellEnd"/>
+        <w:t xml:space="preserve"> Because epydemix's mediated type only accepts a single mediating compartment, the combined force of infection β(I + σI</w:t>
+      </w:r>
       <w:r>
         <w:rPr>
           <w:rFonts w:ascii="Cambria Math" w:hAnsi="Cambria Math" w:cs="Cambria Math"/>
@@ -2135,31 +2077,7 @@
         <w:t>Section 5 — Derived parameters.</w:t>
       </w:r>
       <w:r>
-        <w:t xml:space="preserve"> The compound rates (</w:t>
-      </w:r>
-      <w:proofErr w:type="spellStart"/>
-      <w:r>
-        <w:t>beta_sigma</w:t>
-      </w:r>
-      <w:proofErr w:type="spellEnd"/>
-      <w:r>
-        <w:t xml:space="preserve">, </w:t>
-      </w:r>
-      <w:proofErr w:type="spellStart"/>
-      <w:r>
-        <w:t>beta_delta</w:t>
-      </w:r>
-      <w:proofErr w:type="spellEnd"/>
-      <w:r>
-        <w:t xml:space="preserve">, </w:t>
-      </w:r>
-      <w:proofErr w:type="spellStart"/>
-      <w:r>
-        <w:t>beta_delta_sigma</w:t>
-      </w:r>
-      <w:proofErr w:type="spellEnd"/>
-      <w:r>
-        <w:t>) are pre-computed and registered as named parameters so the transitions can reference them cleanly.</w:t>
+        <w:t xml:space="preserve"> The compound rates (beta_sigma, beta_delta, beta_delta_sigma) are pre-computed and registered as named parameters so the transitions can reference them cleanly.</w:t>
       </w:r>
     </w:p>
     <w:p>
@@ -2189,23 +2107,7 @@
           <w:b/>
           <w:bCs/>
         </w:rPr>
-        <w:t xml:space="preserve">Section 9 — </w:t>
-      </w:r>
-      <w:proofErr w:type="spellStart"/>
-      <w:r>
-        <w:rPr>
-          <w:b/>
-          <w:bCs/>
-        </w:rPr>
-        <w:t>Visualisation</w:t>
-      </w:r>
-      <w:proofErr w:type="spellEnd"/>
-      <w:r>
-        <w:rPr>
-          <w:b/>
-          <w:bCs/>
-        </w:rPr>
-        <w:t>.</w:t>
+        <w:t>Section 9 — Visualisation.</w:t>
       </w:r>
       <w:r>
         <w:t xml:space="preserve"> Three panels: active infectious cases (I vs I</w:t>
@@ -2251,7 +2153,7 @@
 </file>
 
 <file path=word/numbering.xml><?xml version="1.0" encoding="utf-8"?>
-<w:numbering xmlns:wpc="http://schemas.microsoft.com/office/word/2010/wordprocessingCanvas" xmlns:cx="http://schemas.microsoft.com/office/drawing/2014/chartex" xmlns:cx1="http://schemas.microsoft.com/office/drawing/2015/9/8/chartex" xmlns:cx2="http://schemas.microsoft.com/office/drawing/2015/10/21/chartex" xmlns:cx3="http://schemas.microsoft.com/office/drawing/2016/5/9/chartex" xmlns:cx4="http://schemas.microsoft.com/office/drawing/2016/5/10/chartex" xmlns:cx5="http://schemas.microsoft.com/office/drawing/2016/5/11/chartex" xmlns:cx6="http://schemas.microsoft.com/office/drawing/2016/5/12/chartex" xmlns:cx7="http://schemas.microsoft.com/office/drawing/2016/5/13/chartex" xmlns:cx8="http://schemas.microsoft.com/office/drawing/2016/5/14/chartex" xmlns:mc="http://schemas.openxmlformats.org/markup-compatibility/2006" xmlns:aink="http://schemas.microsoft.com/office/drawing/2016/ink" xmlns:am3d="http://schemas.microsoft.com/office/drawing/2017/model3d" xmlns:o="urn:schemas-microsoft-com:office:office" xmlns:oel="http://schemas.microsoft.com/office/2019/extlst" xmlns:r="http://schemas.openxmlformats.org/officeDocument/2006/relationships" xmlns:m="http://schemas.openxmlformats.org/officeDocument/2006/math" xmlns:v="urn:schemas-microsoft-com:vml" xmlns:wp14="http://schemas.microsoft.com/office/word/2010/wordprocessingDrawing" xmlns:wp="http://schemas.openxmlformats.org/drawingml/2006/wordprocessingDrawing" xmlns:w10="urn:schemas-microsoft-com:office:word" xmlns:w="http://schemas.openxmlformats.org/wordprocessingml/2006/main" xmlns:w14="http://schemas.microsoft.com/office/word/2010/wordml" xmlns:w15="http://schemas.microsoft.com/office/word/2012/wordml" xmlns:w16cex="http://schemas.microsoft.com/office/word/2018/wordml/cex" xmlns:w16cid="http://schemas.microsoft.com/office/word/2016/wordml/cid" xmlns:w16="http://schemas.microsoft.com/office/word/2018/wordml" xmlns:w16du="http://schemas.microsoft.com/office/word/2023/wordml/word16du" xmlns:w16sdtdh="http://schemas.microsoft.com/office/word/2020/wordml/sdtdatahash" xmlns:w16sdtfl="http://schemas.microsoft.com/office/word/2024/wordml/sdtformatlock" xmlns:w16se="http://schemas.microsoft.com/office/word/2015/wordml/symex" xmlns:wpg="http://schemas.microsoft.com/office/word/2010/wordprocessingGroup" xmlns:wpi="http://schemas.microsoft.com/office/word/2010/wordprocessingInk" xmlns:wne="http://schemas.microsoft.com/office/word/2006/wordml" xmlns:wps="http://schemas.microsoft.com/office/word/2010/wordprocessingShape" mc:Ignorable="w14 w15 w16se w16cid w16 w16cex w16sdtdh w16sdtfl w16du wp14">
+<w:numbering xmlns:wpc="http://schemas.microsoft.com/office/word/2010/wordprocessingCanvas" xmlns:cx="http://schemas.microsoft.com/office/drawing/2014/chartex" xmlns:cx1="http://schemas.microsoft.com/office/drawing/2015/9/8/chartex" xmlns:cx2="http://schemas.microsoft.com/office/drawing/2015/10/21/chartex" xmlns:cx3="http://schemas.microsoft.com/office/drawing/2016/5/9/chartex" xmlns:cx4="http://schemas.microsoft.com/office/drawing/2016/5/10/chartex" xmlns:cx5="http://schemas.microsoft.com/office/drawing/2016/5/11/chartex" xmlns:cx6="http://schemas.microsoft.com/office/drawing/2016/5/12/chartex" xmlns:cx7="http://schemas.microsoft.com/office/drawing/2016/5/13/chartex" xmlns:cx8="http://schemas.microsoft.com/office/drawing/2016/5/14/chartex" xmlns:mc="http://schemas.openxmlformats.org/markup-compatibility/2006" xmlns:aink="http://schemas.microsoft.com/office/drawing/2016/ink" xmlns:am3d="http://schemas.microsoft.com/office/drawing/2017/model3d" xmlns:o="urn:schemas-microsoft-com:office:office" xmlns:oel="http://schemas.microsoft.com/office/2019/extlst" xmlns:r="http://schemas.openxmlformats.org/officeDocument/2006/relationships" xmlns:m="http://schemas.openxmlformats.org/officeDocument/2006/math" xmlns:v="urn:schemas-microsoft-com:vml" xmlns:wp14="http://schemas.microsoft.com/office/word/2010/wordprocessingDrawing" xmlns:wp="http://schemas.openxmlformats.org/drawingml/2006/wordprocessingDrawing" xmlns:w10="urn:schemas-microsoft-com:office:word" xmlns:w="http://schemas.openxmlformats.org/wordprocessingml/2006/main" xmlns:w14="http://schemas.microsoft.com/office/word/2010/wordml" xmlns:w15="http://schemas.microsoft.com/office/word/2012/wordml" xmlns:w16cei="http://schemas.microsoft.com/office/word/2026/wordml/cei" xmlns:w16cex="http://schemas.microsoft.com/office/word/2018/wordml/cex" xmlns:w16cid="http://schemas.microsoft.com/office/word/2016/wordml/cid" xmlns:w16="http://schemas.microsoft.com/office/word/2018/wordml" xmlns:w16du="http://schemas.microsoft.com/office/word/2023/wordml/word16du" xmlns:w16sdtdh="http://schemas.microsoft.com/office/word/2020/wordml/sdtdatahash" xmlns:w16sdtfl="http://schemas.microsoft.com/office/word/2024/wordml/sdtformatlock" xmlns:w16se="http://schemas.microsoft.com/office/word/2015/wordml/symex" xmlns:wpg="http://schemas.microsoft.com/office/word/2010/wordprocessingGroup" xmlns:wpi="http://schemas.microsoft.com/office/word/2010/wordprocessingInk" xmlns:wne="http://schemas.microsoft.com/office/word/2006/wordml" xmlns:wps="http://schemas.microsoft.com/office/word/2010/wordprocessingShape" mc:Ignorable="w14 w15 w16se w16cid w16 w16cex w16sdtdh w16sdtfl w16du wp14">
   <w:abstractNum w:abstractNumId="0" w15:restartNumberingAfterBreak="0">
     <w:nsid w:val="17A41E48"/>
     <w:multiLevelType w:val="hybridMultilevel"/>
@@ -3521,6 +3423,7 @@
   <w:style w:type="character" w:default="1" w:styleId="DefaultParagraphFont">
     <w:name w:val="Default Paragraph Font"/>
     <w:uiPriority w:val="1"/>
+    <w:semiHidden/>
     <w:unhideWhenUsed/>
   </w:style>
   <w:style w:type="table" w:default="1" w:styleId="TableNormal">

</xml_diff>